<commit_message>
Clean repo to the current final scheduler tree.
Drop the outdated PoC plan and stale integration report, remove the duplicate merge helper, rename the core scheduler module to adaptive_scheduler, and regenerate the current algorithm/integration reports.

Co-authored-by: Cursor <cursoragent@cursor.com>
</commit_message>
<xml_diff>
--- a/reports/跨境算力调度算法测试报告.docx
+++ b/reports/跨境算力调度算法测试报告.docx
@@ -196,7 +196,7 @@
                 <w:b w:val="0"/>
                 <w:sz w:val="18"/>
               </w:rPr>
-              <w:t>src/scheduler/paper_scheduler.py</w:t>
+              <w:t>src/scheduler/adaptive_scheduler.py</w:t>
             </w:r>
           </w:p>
         </w:tc>
@@ -490,7 +490,7 @@
           <w:b w:val="0"/>
           <w:sz w:val="22"/>
         </w:rPr>
-        <w:t>在 30 任务争用场景下，动态权重多目标调度成功率 73.33%（22/30），平均时延 55.48 ms，平均成本 26.56 元，平均能耗指数 7.07，峰值 GPU 利用率 97.5%，单次决策耗时 0.0225 ms。成功率与先到先服务、最小延迟、遗传算法同处最高档；同档内本方法时延与成本更优。未调度任务：T03, T14, T15, T23, T25, T27, T28, T30。</w:t>
+        <w:t>在 30 任务争用场景下，动态权重多目标调度成功率 73.33%（22/30），平均时延 55.48 ms，平均成本 26.56 元，平均能耗指数 7.07，峰值 GPU 利用率 97.5%，单次决策耗时 0.0175 ms。成功率与先到先服务、最小延迟、遗传算法同处最高档；同档内本方法时延与成本更优。未调度任务：T03, T14, T15, T23, T25, T27, T28, T30。</w:t>
       </w:r>
     </w:p>
     <w:tbl>
@@ -779,7 +779,7 @@
                 <w:b w:val="0"/>
                 <w:sz w:val="18"/>
               </w:rPr>
-              <w:t>0.0180</w:t>
+              <w:t>0.0522</w:t>
             </w:r>
           </w:p>
         </w:tc>
@@ -916,7 +916,7 @@
                 <w:b w:val="0"/>
                 <w:sz w:val="18"/>
               </w:rPr>
-              <w:t>0.0129</w:t>
+              <w:t>0.0136</w:t>
             </w:r>
           </w:p>
         </w:tc>
@@ -1053,7 +1053,7 @@
                 <w:b w:val="0"/>
                 <w:sz w:val="18"/>
               </w:rPr>
-              <w:t>0.0136</w:t>
+              <w:t>0.0133</w:t>
             </w:r>
           </w:p>
         </w:tc>
@@ -1190,7 +1190,7 @@
                 <w:b w:val="0"/>
                 <w:sz w:val="18"/>
               </w:rPr>
-              <w:t>0.0148</w:t>
+              <w:t>0.0157</w:t>
             </w:r>
           </w:p>
         </w:tc>
@@ -1327,7 +1327,7 @@
                 <w:b w:val="0"/>
                 <w:sz w:val="18"/>
               </w:rPr>
-              <w:t>11.8762</w:t>
+              <w:t>12.2547</w:t>
             </w:r>
           </w:p>
         </w:tc>
@@ -1464,7 +1464,7 @@
                 <w:b w:val="0"/>
                 <w:sz w:val="18"/>
               </w:rPr>
-              <w:t>0.0225</w:t>
+              <w:t>0.0175</w:t>
             </w:r>
           </w:p>
         </w:tc>
@@ -2001,7 +2001,7 @@
           <w:b w:val="0"/>
           <w:sz w:val="22"/>
         </w:rPr>
-        <w:t>相对遗传算法，在线打分平均加速约 528 倍（GA 11.88 ms，本方法 0.0225 ms）。</w:t>
+        <w:t>相对遗传算法，在线打分平均加速约 700 倍（GA 12.25 ms，本方法 0.0175 ms）。</w:t>
       </w:r>
     </w:p>
     <w:p>
@@ -3227,7 +3227,7 @@
           <w:b w:val="0"/>
           <w:sz w:val="22"/>
         </w:rPr>
-        <w:t>控制面默认使用本算法为海南/重庆真实节点选点，并保留 16GB 显存等硬约束桥接逻辑。现场 ResNet 分片推理、结果汇聚与安全负向用例的证据见《跨境算力调度真实联调测试报告》。</w:t>
+        <w:t>控制面默认使用本算法为海南/重庆真实节点选点，并保留 16GB 显存等硬约束桥接逻辑。现场 ResNet 分片推理、短时占卡观测利用率、结果汇聚与安全负向用例见《跨境算力调度真实联调测试报告》。</w:t>
       </w:r>
     </w:p>
     <w:p>
@@ -3254,7 +3254,7 @@
           <w:b w:val="0"/>
           <w:sz w:val="22"/>
         </w:rPr>
-        <w:t>测试表明，自适应动态权重多目标调度在本场景成功率达到 73.33%，优于静态本地（46.67%）与最小成本（70.0%）；在最高成功率档内取得更低时延与成本（55.48 ms / 26.56 元），峰值利用率 97.5%，决策时延 0.0225 ms，满足跨境算力联合调度的在线决策需求。</w:t>
+        <w:t>测试表明，自适应动态权重多目标调度在本场景成功率达到 73.33%，优于静态本地（46.67%）与最小成本（70.0%）；在最高成功率档内取得更低时延与成本（55.48 ms / 26.56 元），峰值利用率 97.5%，决策时延 0.0175 ms，满足跨境算力联合调度的在线决策需求。</w:t>
       </w:r>
     </w:p>
     <w:sectPr>

</xml_diff>